<commit_message>
Correcciones de la verificación adversarial en los documentos Word de entrega
Tres precisiones en las instrucciones (el código embebido no cambió y sigue
siendo fiel 1:1 a las fuentes):
- Conteo exacto de líneas del código base: 3.603 (antes decía 3.604).
- La advertencia del salt ahora señala la Celda 18 (doc Colab) / Sección 15
  al final del bloque (doc IA), donde realmente se edita PERSON_ID_HASH_SALT.
- El paso 6 del doc Colab ubica correctamente las salidas: CSV en
  salida_prediccion_el/tables, informe/model_card/Excel en la raíz de la
  carpeta, y el ZIP en /content junto a la carpeta de salida.

MEMORIA.md documenta la verificación (3 agentes, 33 comprobaciones superadas).

Co-Authored-By: Claude Fable 5 <noreply@anthropic.com>
Claude-Session: https://claude.ai/code/session_01LSW4qxgg7GezxDaWrmkMpY
</commit_message>
<xml_diff>
--- a/entregables/prediccion_enfermedad_laboral/word/Codigo_Google_Colab_Prediccion_EL_V4.docx
+++ b/entregables/prediccion_enfermedad_laboral/word/Codigo_Google_Colab_Prediccion_EL_V4.docx
@@ -209,7 +209,7 @@
                 <w:sz w:val="20"/>
                 <w:szCs w:val="20"/>
               </w:rPr>
-              <w:t xml:space="preserve">3604 líneas de Python, divididas en 18 celdas</w:t>
+              <w:t xml:space="preserve">3603 líneas de Python, divididas en 18 celdas</w:t>
             </w:r>
           </w:p>
         </w:tc>
@@ -438,7 +438,17 @@
         <w:spacing w:after="80" w:before="40"/>
       </w:pPr>
       <w:r>
-        <w:t xml:space="preserve">Ejecute la Celda 18: corre todo el pipeline. Al terminar encontrará en </w:t>
+        <w:t xml:space="preserve">Ejecute la Celda 18: corre todo el pipeline. Al terminar encontrará: el informe </w:t>
+      </w:r>
+      <w:r>
+        <w:rPr>
+          <w:b/>
+          <w:bCs/>
+        </w:rPr>
+        <w:t xml:space="preserve">informe_predictivo.md</w:t>
+      </w:r>
+      <w:r>
+        <w:t xml:space="preserve">, el model_card.json y el resumen en Excel en la carpeta </w:t>
       </w:r>
       <w:r>
         <w:rPr>
@@ -448,7 +458,27 @@
         <w:t xml:space="preserve">/content/salida_prediccion_el</w:t>
       </w:r>
       <w:r>
-        <w:t xml:space="preserve"> las tablas CSV (12 a 15 son las predicciones por horizonte, patología, cargo y centro), el informe informe_predictivo.md, el model_card.json, un resumen en Excel y un ZIP con todo.</w:t>
+        <w:t xml:space="preserve">; las tablas CSV en la subcarpeta </w:t>
+      </w:r>
+      <w:r>
+        <w:rPr>
+          <w:b/>
+          <w:bCs/>
+        </w:rPr>
+        <w:t xml:space="preserve">/content/salida_prediccion_el/tables</w:t>
+      </w:r>
+      <w:r>
+        <w:t xml:space="preserve"> (las tablas 12 a 15 son las predicciones por horizonte, patología, cargo y centro); y un ZIP con todo en </w:t>
+      </w:r>
+      <w:r>
+        <w:rPr>
+          <w:b/>
+          <w:bCs/>
+        </w:rPr>
+        <w:t xml:space="preserve">/content/salida_prediccion_el.zip</w:t>
+      </w:r>
+      <w:r>
+        <w:t xml:space="preserve"> (aparece en /content, al lado de la carpeta de salida, no dentro de ella).</w:t>
       </w:r>
     </w:p>
     <w:p>
@@ -461,7 +491,17 @@
         <w:spacing w:after="80" w:before="40"/>
       </w:pPr>
       <w:r>
-        <w:t xml:space="preserve">Descargue el ZIP desde el panel de Archivos, o abra directamente </w:t>
+        <w:t xml:space="preserve">Descargue el ZIP </w:t>
+      </w:r>
+      <w:r>
+        <w:rPr>
+          <w:b/>
+          <w:bCs/>
+        </w:rPr>
+        <w:t xml:space="preserve">salida_prediccion_el.zip</w:t>
+      </w:r>
+      <w:r>
+        <w:t xml:space="preserve"> desde el panel de Archivos, o abra directamente </w:t>
       </w:r>
       <w:r>
         <w:rPr>
@@ -514,7 +554,7 @@
         <w:t xml:space="preserve">1. Salt de seudonimización obligatorio. </w:t>
       </w:r>
       <w:r>
-        <w:t xml:space="preserve">Antes de ejecutar con datos reales, reemplace PERSON_ID_HASH_SALT por un valor secreto y propio de su organización (Celda/Sección 15 de configuración). Si se deja el valor de plantilla, el pipeline se niega a ejecutar (validate_privacy_config).</w:t>
+        <w:t xml:space="preserve">Antes de ejecutar con datos reales, reemplace PERSON_ID_HASH_SALT por un valor secreto y propio de su organización (en la Celda 18 — la Sección 15 del código, la única celda que se edita). Si se deja el valor de plantilla, el pipeline se niega a ejecutar (validate_privacy_config).</w:t>
       </w:r>
     </w:p>
     <w:p>

</xml_diff>